<commit_message>
Migrate portfolio from Streamlit to React Vite
</commit_message>
<xml_diff>
--- a/assets/VoPhuocNhat_CV.docx
+++ b/assets/VoPhuocNhat_CV.docx
@@ -48,7 +48,7 @@
           <w:sz w:val="18"/>
           <w:szCs w:val="18"/>
         </w:rPr>
-        <w:t xml:space="preserve">Thu Duc City, HCMC  |  nhat.vophuoc@gmail.com  |  (+84) 384 792 943  |  phuocnhat.dev  |  </w:t>
+        <w:t xml:space="preserve">Thu Duc City, HCMC  |  nhat.vophuoc@gmail.com  |  (+84) 384 792 943  |  </w:t>
       </w:r>
       <w:hyperlink r:id="rId6" w:history="1">
         <w:r>
@@ -57,7 +57,17 @@
             <w:sz w:val="18"/>
             <w:szCs w:val="18"/>
           </w:rPr>
-          <w:t>github.com/phuoc</w:t>
+          <w:t>phuocnha</w:t>
+        </w:r>
+        <w:bookmarkStart w:id="0" w:name="_GoBack"/>
+        <w:bookmarkEnd w:id="0"/>
+        <w:r>
+          <w:rPr>
+            <w:rStyle w:val="Hyperlink"/>
+            <w:sz w:val="18"/>
+            <w:szCs w:val="18"/>
+          </w:rPr>
+          <w:t>t</w:t>
         </w:r>
         <w:r>
           <w:rPr>
@@ -65,15 +75,25 @@
             <w:sz w:val="18"/>
             <w:szCs w:val="18"/>
           </w:rPr>
-          <w:t>n</w:t>
+          <w:t xml:space="preserve">.dev </w:t>
         </w:r>
+      </w:hyperlink>
+      <w:r>
+        <w:rPr>
+          <w:color w:val="555555"/>
+          <w:sz w:val="18"/>
+          <w:szCs w:val="18"/>
+        </w:rPr>
+        <w:t xml:space="preserve"> |  </w:t>
+      </w:r>
+      <w:hyperlink r:id="rId7" w:history="1">
         <w:r>
           <w:rPr>
             <w:rStyle w:val="Hyperlink"/>
             <w:sz w:val="18"/>
             <w:szCs w:val="18"/>
           </w:rPr>
-          <w:t>hat1011</w:t>
+          <w:t>github.com/phuocnhat1011</w:t>
         </w:r>
       </w:hyperlink>
     </w:p>
@@ -111,21 +131,7 @@
           <w:sz w:val="20"/>
           <w:szCs w:val="20"/>
         </w:rPr>
-        <w:t xml:space="preserve">Financial Data Analyst with 2 years </w:t>
-      </w:r>
-      <w:r>
-        <w:rPr>
-          <w:sz w:val="20"/>
-          <w:szCs w:val="20"/>
-        </w:rPr>
-        <w:t>of experience in Vietnamese securities market data, specializing in market data automation, financial time-series processing, data quality validation, and trading-related analytical workflows. Skilled in R, Python, SQL basics, and Power BI, with hands-on e</w:t>
-      </w:r>
-      <w:r>
-        <w:rPr>
-          <w:sz w:val="20"/>
-          <w:szCs w:val="20"/>
-        </w:rPr>
-        <w:t>xperience collecting data from market APIs, cleaning and structuring datasets, supporting rule-based stock screening workflows, and building reporting-ready outputs and dashboards for market monitoring and analysis.</w:t>
+        <w:t>Financial Data Analyst with 2 years of experience in Vietnamese securities market data, specializing in market data automation, financial time-series processing, data quality validation, and trading-related analytical workflows. Skilled in R, Python, SQL basics, and Power BI, with hands-on experience collecting data from market APIs, cleaning and structuring datasets, supporting rule-based stock screening workflows, and building reporting-ready outputs and dashboards for market monitoring and analysis.</w:t>
       </w:r>
     </w:p>
     <w:p>
@@ -165,10 +171,7 @@
       </w:r>
       <w:r>
         <w:tab/>
-        <w:t xml:space="preserve">R, Python, </w:t>
-      </w:r>
-      <w:r>
-        <w:t>SQL basics</w:t>
+        <w:t>R, Python, SQL basics</w:t>
       </w:r>
     </w:p>
     <w:p>
@@ -187,10 +190,7 @@
       </w:r>
       <w:r>
         <w:tab/>
-        <w:t xml:space="preserve">pandas, data.table, dplyr, requests / httr, jsonlite, API extraction, </w:t>
-      </w:r>
-      <w:r>
-        <w:t>data cleaning, transformation, validation</w:t>
+        <w:t>pandas, data.table, dplyr, requests / httr, jsonlite, API extraction, data cleaning, transformation, validation</w:t>
       </w:r>
     </w:p>
     <w:p>
@@ -209,10 +209,7 @@
       </w:r>
       <w:r>
         <w:tab/>
-        <w:t>Power BI, DAX, Power Query, dashboard design, KPI reporting, ad-hoc analytica</w:t>
-      </w:r>
-      <w:r>
-        <w:t>l outputs</w:t>
+        <w:t>Power BI, DAX, Power Query, dashboard design, KPI reporting, ad-hoc analytical outputs</w:t>
       </w:r>
     </w:p>
     <w:p>
@@ -308,14 +305,7 @@
           <w:b/>
           <w:sz w:val="22"/>
         </w:rPr>
-        <w:t>Juni</w:t>
-      </w:r>
-      <w:r>
-        <w:rPr>
-          <w:b/>
-          <w:sz w:val="22"/>
-        </w:rPr>
-        <w:t>or Financial Data Analyst</w:t>
+        <w:t>Junior Financial Data Analyst</w:t>
       </w:r>
       <w:r>
         <w:rPr>
@@ -371,14 +361,7 @@
           <w:sz w:val="20"/>
           <w:szCs w:val="20"/>
         </w:rPr>
-        <w:t xml:space="preserve">• Processed </w:t>
-      </w:r>
-      <w:r>
-        <w:rPr>
-          <w:sz w:val="20"/>
-          <w:szCs w:val="20"/>
-        </w:rPr>
-        <w:t>financial time-series datasets for stock screening and trading-related workflows, including ticker standardization, trading date validation, missing value handling, duplicate checks, and abnormal data detection.</w:t>
+        <w:t>• Processed financial time-series datasets for stock screening and trading-related workflows, including ticker standardization, trading date validation, missing value handling, duplicate checks, and abnormal data detection.</w:t>
       </w:r>
     </w:p>
     <w:p>
@@ -395,14 +378,7 @@
           <w:sz w:val="20"/>
           <w:szCs w:val="20"/>
         </w:rPr>
-        <w:t>• Built and deployed an automated VN30F1M in</w:t>
-      </w:r>
-      <w:r>
-        <w:rPr>
-          <w:sz w:val="20"/>
-          <w:szCs w:val="20"/>
-        </w:rPr>
-        <w:t>traday hedging system in R, using Grid Search backtesting to optimize parameters and State Machine logic for real-time SSI FastConnect API order execution.</w:t>
+        <w:t>• Built and deployed an automated VN30F1M intraday hedging system in R, using Grid Search backtesting to optimize parameters and State Machine logic for real-time SSI FastConnect API order execution.</w:t>
       </w:r>
     </w:p>
     <w:p>
@@ -419,14 +395,7 @@
           <w:sz w:val="20"/>
           <w:szCs w:val="20"/>
         </w:rPr>
-        <w:t>• Prepared screening-ready market data outputs for internal rule-based stock selection workflows, en</w:t>
-      </w:r>
-      <w:r>
-        <w:rPr>
-          <w:sz w:val="20"/>
-          <w:szCs w:val="20"/>
-        </w:rPr>
-        <w:t>suring clean, structured, and up-to-date datasets for downstream analysis and system use cases.</w:t>
+        <w:t>• Prepared screening-ready market data outputs for internal rule-based stock selection workflows, ensuring clean, structured, and up-to-date datasets for downstream analysis and system use cases.</w:t>
       </w:r>
     </w:p>
     <w:p>
@@ -443,14 +412,7 @@
           <w:sz w:val="20"/>
           <w:szCs w:val="20"/>
         </w:rPr>
-        <w:t>• Created ad-hoc analytical dashboards and reporting-ready outputs using R/Python and Power BI, including sector-level stock comparisons, price movement trackin</w:t>
-      </w:r>
-      <w:r>
-        <w:rPr>
-          <w:sz w:val="20"/>
-          <w:szCs w:val="20"/>
-        </w:rPr>
-        <w:t>g, liquidity monitoring, trading signal summaries, and watchlist-ready datasets for internal review.</w:t>
+        <w:t>• Created ad-hoc analytical dashboards and reporting-ready outputs using R/Python and Power BI, including sector-level stock comparisons, price movement tracking, liquidity monitoring, trading signal summaries, and watchlist-ready datasets for internal review.</w:t>
       </w:r>
     </w:p>
     <w:p>
@@ -467,14 +429,7 @@
           <w:sz w:val="20"/>
           <w:szCs w:val="20"/>
         </w:rPr>
-        <w:t xml:space="preserve">• Designed internal monitoring dashboards using echarts4r to visualize candlestick patterns, entry/exit signals, and system status; integrated Discord </w:t>
-      </w:r>
-      <w:r>
-        <w:rPr>
-          <w:sz w:val="20"/>
-          <w:szCs w:val="20"/>
-        </w:rPr>
-        <w:t>Webhooks for real-time data quality and anomaly alerts.</w:t>
+        <w:t>• Designed internal monitoring dashboards using echarts4r to visualize candlestick patterns, entry/exit signals, and system status; integrated Discord Webhooks for real-time data quality and anomaly alerts.</w:t>
       </w:r>
     </w:p>
     <w:p>
@@ -491,16 +446,7 @@
           <w:sz w:val="20"/>
           <w:szCs w:val="20"/>
         </w:rPr>
-        <w:t>• Developed automated R functions to load processed market datasets into relational databases managed via Navicat, ensuring data availability for front-end, monitoring, and analytical workflow</w:t>
-      </w:r>
-      <w:bookmarkStart w:id="0" w:name="_GoBack"/>
-      <w:bookmarkEnd w:id="0"/>
-      <w:r>
-        <w:rPr>
-          <w:sz w:val="20"/>
-          <w:szCs w:val="20"/>
-        </w:rPr>
-        <w:t>s.</w:t>
+        <w:t>• Developed automated R functions to load processed market datasets into relational databases managed via Navicat, ensuring data availability for front-end, monitoring, and analytical workflows.</w:t>
       </w:r>
     </w:p>
     <w:p>
@@ -518,14 +464,7 @@
           <w:b/>
           <w:sz w:val="22"/>
         </w:rPr>
-        <w:t>Finan</w:t>
-      </w:r>
-      <w:r>
-        <w:rPr>
-          <w:b/>
-          <w:sz w:val="22"/>
-        </w:rPr>
-        <w:t>cial Data Analyst Intern</w:t>
+        <w:t>Financial Data Analyst Intern</w:t>
       </w:r>
       <w:r>
         <w:rPr>
@@ -581,14 +520,7 @@
           <w:sz w:val="20"/>
           <w:szCs w:val="20"/>
         </w:rPr>
-        <w:t>• As</w:t>
-      </w:r>
-      <w:r>
-        <w:rPr>
-          <w:sz w:val="20"/>
-          <w:szCs w:val="20"/>
-        </w:rPr>
-        <w:t>sisted in preparing structured market data tables to track selected stocks, price movements, trading signals, and daily performance changes, supporting internal monitoring and data review workflows.</w:t>
+        <w:t>• Assisted in preparing structured market data tables to track selected stocks, price movements, trading signals, and daily performance changes, supporting internal monitoring and data review workflows.</w:t>
       </w:r>
     </w:p>
     <w:p>
@@ -628,15 +560,7 @@
           <w:color w:val="555555"/>
           <w:sz w:val="22"/>
         </w:rPr>
-        <w:t xml:space="preserve">Sep 2023 </w:t>
-      </w:r>
-      <w:r>
-        <w:rPr>
-          <w:i/>
-          <w:color w:val="555555"/>
-          <w:sz w:val="22"/>
-        </w:rPr>
-        <w:t>– Dec 2023</w:t>
+        <w:t>Sep 2023 – Dec 2023</w:t>
       </w:r>
     </w:p>
     <w:p>
@@ -666,14 +590,7 @@
           <w:sz w:val="20"/>
           <w:szCs w:val="20"/>
         </w:rPr>
-        <w:t>• Monitored price movements and trading signals for a watchlist of 20+ stocks; summariz</w:t>
-      </w:r>
-      <w:r>
-        <w:rPr>
-          <w:sz w:val="20"/>
-          <w:szCs w:val="20"/>
-        </w:rPr>
-        <w:t>ed key findings into structured briefings for senior advisors.</w:t>
+        <w:t>• Monitored price movements and trading signals for a watchlist of 20+ stocks; summarized key findings into structured briefings for senior advisors.</w:t>
       </w:r>
     </w:p>
     <w:p>
@@ -850,16 +767,7 @@
           <w:sz w:val="24"/>
           <w:szCs w:val="24"/>
         </w:rPr>
-        <w:t>E</w:t>
-      </w:r>
-      <w:r>
-        <w:rPr>
-          <w:b/>
-          <w:color w:val="1F4E79"/>
-          <w:sz w:val="24"/>
-          <w:szCs w:val="24"/>
-        </w:rPr>
-        <w:t>DUCATION</w:t>
+        <w:t>EDUCATION</w:t>
       </w:r>
     </w:p>
     <w:p>
@@ -1460,10 +1368,6 @@
     <w:lsdException w:name="Book Title" w:uiPriority="33" w:qFormat="1"/>
     <w:lsdException w:name="Bibliography" w:semiHidden="1" w:uiPriority="37" w:unhideWhenUsed="1"/>
     <w:lsdException w:name="TOC Heading" w:semiHidden="1" w:uiPriority="39" w:unhideWhenUsed="1" w:qFormat="1"/>
-    <w:lsdException w:name="Grid Table Light" w:semiHidden="1" w:unhideWhenUsed="1"/>
-    <w:lsdException w:name="Grid Table 1 Light" w:semiHidden="1" w:unhideWhenUsed="1"/>
-    <w:lsdException w:name="Grid Table 2" w:semiHidden="1" w:unhideWhenUsed="1"/>
-    <w:lsdException w:name="Grid Table 3" w:semiHidden="1" w:unhideWhenUsed="1"/>
     <w:lsdException w:name="Grid Table 4" w:uiPriority="49"/>
     <w:lsdException w:name="Grid Table 5 Dark" w:uiPriority="50"/>
     <w:lsdException w:name="Grid Table 6 Colorful" w:uiPriority="51"/>
@@ -12924,7 +12828,7 @@
 </file>
 
 <file path=customXml/itemProps1.xml><?xml version="1.0" encoding="utf-8"?>
-<ds:datastoreItem xmlns:ds="http://schemas.openxmlformats.org/officeDocument/2006/customXml" ds:itemID="{E9A2384D-CEB2-40D2-97F7-13E5F7BFC707}">
+<ds:datastoreItem xmlns:ds="http://schemas.openxmlformats.org/officeDocument/2006/customXml" ds:itemID="{ABB6957A-2E5B-4E8D-B415-0C9E5B15517A}">
   <ds:schemaRefs>
     <ds:schemaRef ds:uri="http://schemas.openxmlformats.org/officeDocument/2006/bibliography"/>
   </ds:schemaRefs>

</xml_diff>